<commit_message>
enhance employee leave dialog with day conversion; modify leave type details for better clarity; fix docx generator to include day calculation; remove outdated leave service tests and working time calculation tests; Refactor leave adjustment service to use Dayjs for date handling
</commit_message>
<xml_diff>
--- a/frontend/public/templates/leaveRequest.docx
+++ b/frontend/public/templates/leaveRequest.docx
@@ -105,8 +105,6 @@
               </w:rPr>
               <w:t>YY</w:t>
             </w:r>
-            <w:bookmarkStart w:id="0" w:name="_GoBack"/>
-            <w:bookmarkEnd w:id="0"/>
             <w:r>
               <w:rPr>
                 <w:rFonts w:ascii="標楷體" w:eastAsia="標楷體" w:hAnsi="標楷體"/>
@@ -495,19 +493,35 @@
               <w:rPr>
                 <w:rFonts w:ascii="標楷體" w:eastAsia="標楷體" w:hAnsi="標楷體"/>
               </w:rPr>
-              <w:t>hour}小時{</w:t>
-            </w:r>
-            <w:r>
-              <w:rPr>
-                <w:rFonts w:ascii="標楷體" w:eastAsia="標楷體" w:hAnsi="標楷體" w:hint="eastAsia"/>
-              </w:rPr>
-              <w:t>m</w:t>
-            </w:r>
-            <w:r>
-              <w:rPr>
-                <w:rFonts w:ascii="標楷體" w:eastAsia="標楷體" w:hAnsi="標楷體"/>
-              </w:rPr>
-              <w:t>inutes}分鐘</w:t>
+              <w:t>hour}小時</w:t>
+            </w:r>
+            <w:bookmarkStart w:id="0" w:name="_GoBack"/>
+            <w:bookmarkEnd w:id="0"/>
+          </w:p>
+          <w:p>
+            <w:pPr>
+              <w:jc w:val="center"/>
+              <w:rPr>
+                <w:rFonts w:ascii="標楷體" w:eastAsia="標楷體" w:hAnsi="標楷體" w:hint="eastAsia"/>
+              </w:rPr>
+            </w:pPr>
+            <w:r>
+              <w:rPr>
+                <w:rFonts w:ascii="標楷體" w:eastAsia="標楷體" w:hAnsi="標楷體"/>
+              </w:rPr>
+              <w:t>共 {</w:t>
+            </w:r>
+            <w:r>
+              <w:rPr>
+                <w:rFonts w:ascii="標楷體" w:eastAsia="標楷體" w:hAnsi="標楷體" w:hint="eastAsia"/>
+              </w:rPr>
+              <w:t>d</w:t>
+            </w:r>
+            <w:r>
+              <w:rPr>
+                <w:rFonts w:ascii="標楷體" w:eastAsia="標楷體" w:hAnsi="標楷體"/>
+              </w:rPr>
+              <w:t>ay} 天</w:t>
             </w:r>
           </w:p>
         </w:tc>
@@ -562,7 +576,7 @@
             <w:pPr>
               <w:jc w:val="center"/>
               <w:rPr>
-                <w:rFonts w:ascii="標楷體" w:eastAsia="標楷體" w:hAnsi="標楷體"/>
+                <w:rFonts w:ascii="標楷體" w:eastAsia="標楷體" w:hAnsi="標楷體" w:hint="eastAsia"/>
               </w:rPr>
             </w:pPr>
             <w:r>
@@ -676,7 +690,7 @@
               <w:rPr>
                 <w:rFonts w:ascii="標楷體" w:eastAsia="標楷體" w:hAnsi="標楷體" w:hint="eastAsia"/>
               </w:rPr>
-              <w:t>管理部</w:t>
+              <w:t>人事</w:t>
             </w:r>
           </w:p>
         </w:tc>

</xml_diff>

<commit_message>
feat: add substitute name to generted docx
</commit_message>
<xml_diff>
--- a/frontend/public/templates/leaveRequest.docx
+++ b/frontend/public/templates/leaveRequest.docx
@@ -495,14 +495,12 @@
               </w:rPr>
               <w:t>hour}小時</w:t>
             </w:r>
-            <w:bookmarkStart w:id="0" w:name="_GoBack"/>
-            <w:bookmarkEnd w:id="0"/>
           </w:p>
           <w:p>
             <w:pPr>
               <w:jc w:val="center"/>
               <w:rPr>
-                <w:rFonts w:ascii="標楷體" w:eastAsia="標楷體" w:hAnsi="標楷體" w:hint="eastAsia"/>
+                <w:rFonts w:ascii="標楷體" w:eastAsia="標楷體" w:hAnsi="標楷體"/>
               </w:rPr>
             </w:pPr>
             <w:r>
@@ -576,7 +574,7 @@
             <w:pPr>
               <w:jc w:val="center"/>
               <w:rPr>
-                <w:rFonts w:ascii="標楷體" w:eastAsia="標楷體" w:hAnsi="標楷體" w:hint="eastAsia"/>
+                <w:rFonts w:ascii="標楷體" w:eastAsia="標楷體" w:hAnsi="標楷體"/>
               </w:rPr>
             </w:pPr>
             <w:r>
@@ -633,10 +631,31 @@
           </w:tcPr>
           <w:p>
             <w:pPr>
-              <w:rPr>
-                <w:rFonts w:ascii="標楷體" w:eastAsia="標楷體" w:hAnsi="標楷體"/>
-              </w:rPr>
-            </w:pPr>
+              <w:jc w:val="center"/>
+              <w:rPr>
+                <w:rFonts w:ascii="標楷體" w:eastAsia="標楷體" w:hAnsi="標楷體"/>
+              </w:rPr>
+            </w:pPr>
+            <w:r>
+              <w:rPr>
+                <w:rFonts w:ascii="標楷體" w:eastAsia="標楷體" w:hAnsi="標楷體"/>
+              </w:rPr>
+              <w:t>{</w:t>
+            </w:r>
+            <w:bookmarkStart w:id="0" w:name="_GoBack"/>
+            <w:bookmarkEnd w:id="0"/>
+            <w:r>
+              <w:rPr>
+                <w:rFonts w:ascii="標楷體" w:eastAsia="標楷體" w:hAnsi="標楷體"/>
+              </w:rPr>
+              <w:t>substituteName</w:t>
+            </w:r>
+            <w:r>
+              <w:rPr>
+                <w:rFonts w:ascii="標楷體" w:eastAsia="標楷體" w:hAnsi="標楷體"/>
+              </w:rPr>
+              <w:t>}</w:t>
+            </w:r>
           </w:p>
         </w:tc>
         <w:tc>

</xml_diff>